<commit_message>
Dashboard: replace Bogorad references with NGL energy risk-premia paper
- app.py / project doc / CLAUDE.md / verification prompt: every "Mark Bogorad"
  / "Bogorad's energy reference" now cites the NGL energy risk-premia paper
  ("Risk Premia in Diversified Energy Portfolios"). F12 framed as the NGL paper's
  energy reference contract; copper's empirically stronger contract is F8.
- generate_tradebooks.py: keep the full date axis (no dropped rows); warmup cells
  are blank (not 0); neutral filenames; CTA warmup documented as ~314d (63+252)
  per Baz-Granger Eqs 29-33. Tradebooks regenerated.
- Verified: app runs headless via Streamlit AppTest with 0 exceptions. The warmup
  change is display-only; active-day Sharpe is unchanged (warmup days never trade).

🤖 Generated with [Claude Code](https://claude.com/claude-code)
</commit_message>
<xml_diff>
--- a/LME_Copper_RiskPremia_ProjectOverview.docx
+++ b/LME_Copper_RiskPremia_ProjectOverview.docx
@@ -398,7 +398,7 @@
           <w:b w:val="0"/>
           <w:sz w:val="19"/>
         </w:rPr>
-        <w:t>F12 (Bogorad's energy reference) gives +0.184 for copper — energy calibration sub-optimal.</w:t>
+        <w:t>F12 (the NGL energy paper's reference contract) is weaker for copper — energy calibration sub-optimal.</w:t>
       </w:r>
     </w:p>
     <w:p>
@@ -2321,7 +2321,7 @@
           <w:b w:val="0"/>
           <w:sz w:val="19"/>
         </w:rPr>
-        <w:t>Reproduce Bogorad (2023) sub-period table across Pre-2022 / Post-2022 and extend to Pre-2020 / COVID / Post-COVID splits.</w:t>
+        <w:t>Reproduce the NGL energy paper's sub-period table across Pre-2022 / Post-2022 and extend to Pre-2020 / COVID / Post-COVID splits.</w:t>
       </w:r>
     </w:p>
     <w:p>
@@ -2546,7 +2546,7 @@
           <w:i w:val="0"/>
           <w:sz w:val="19"/>
         </w:rPr>
-        <w:t>Bogorad, M. (2023). Risk Premia in Diversified Energy Portfolios. (Unpublished, Hartree Partners.)</w:t>
+        <w:t>NGL Energy Risk-Premia paper. Risk Premia in Diversified Energy Portfolios.</w:t>
       </w:r>
     </w:p>
     <w:p>

</xml_diff>

<commit_message>
TC: charge transaction costs on F1_raw (actual traded price), not F1_continuous
- All four tabs (Momentum, Carry, Value, Portfolio) now compute TC as
  |dPos| x (bps/10000/2) x F1_raw(t). Gross PnL and returns remain on
  F1_continuous; only the cost term changes. 11 computation sites updated
  (mains + walk-forwards), plus user-facing TC formula text.
- Rationale: the bid-ask spread is paid on the real front-month price (F1_raw);
  F1_continuous is a back-adjusted index used only for PnL accounting.
- Effect for copper is small and consistently positive (~+0.000 to +0.001 net
  Sharpe at 5bps) since F1_raw ~ F1_continuous (mean ratio 0.990).
- Adds research artifacts: Project Overview section 6.1 (inverse-vol trailing-window
  study) and a standalone Research Appendix doc (strategies/methods explored but
  not productionised).

Verified: Streamlit AppTest runs all 10 tabs + TC branches with 0 exceptions.

🤖 Generated with [Claude Code](https://claude.com/claude-code)
</commit_message>
<xml_diff>
--- a/LME_Copper_RiskPremia_ProjectOverview.docx
+++ b/LME_Copper_RiskPremia_ProjectOverview.docx
@@ -2347,6 +2347,1025 @@
     </w:p>
     <w:p>
       <w:pPr>
+        <w:spacing w:before="0" w:after="120"/>
+      </w:pPr>
+    </w:p>
+    <w:p>
+      <w:pPr>
+        <w:spacing w:before="160" w:after="40"/>
+      </w:pPr>
+      <w:r>
+        <w:rPr>
+          <w:b/>
+          <w:color w:val="1A1A1A"/>
+          <w:sz w:val="20"/>
+        </w:rPr>
+        <w:t>6.1  Research — Inverse-Vol Weighting: Trailing-Window Sensitivity</w:t>
+      </w:r>
+    </w:p>
+    <w:p>
+      <w:pPr>
+        <w:spacing w:before="0" w:after="80"/>
+      </w:pPr>
+      <w:r>
+        <w:rPr>
+          <w:i w:val="0"/>
+          <w:sz w:val="19"/>
+        </w:rPr>
+        <w:t>As an extension to the equal-weight (EW) benchmark we studied inverse-volatility weighting, where each sleeve is weighted by 1 / its trailing return-volatility (renormalised daily and lagged one day to avoid look-ahead). We swept the trailing-vol estimation window to identify the most stable horizon. Full sample 2006–2025 (5,053 trading days); legs = MA(35,43), Carry-Momentum 20d, Value V1 F8 5yr. Figures are active-day annualised Sharpe and cumulative P&amp;L drawdown in USD per metric ton.</w:t>
+      </w:r>
+    </w:p>
+    <w:tbl>
+      <w:tblPr>
+        <w:tblStyle w:val="TableGrid"/>
+        <w:tblW w:type="auto" w:w="0"/>
+        <w:jc w:val="center"/>
+        <w:tblLook w:firstColumn="1" w:firstRow="1" w:lastColumn="0" w:lastRow="0" w:noHBand="0" w:noVBand="1" w:val="04A0"/>
+      </w:tblPr>
+      <w:tblGrid>
+        <w:gridCol w:w="1624"/>
+        <w:gridCol w:w="1624"/>
+        <w:gridCol w:w="1624"/>
+        <w:gridCol w:w="1624"/>
+        <w:gridCol w:w="1624"/>
+        <w:gridCol w:w="1624"/>
+      </w:tblGrid>
+      <w:tr>
+        <w:tc>
+          <w:tcPr>
+            <w:tcW w:type="dxa" w:w="3024"/>
+            <w:shd w:val="clear" w:color="auto" w:fill="B87333"/>
+          </w:tcPr>
+          <w:p>
+            <w:pPr>
+              <w:jc w:val="center"/>
+            </w:pPr>
+            <w:r>
+              <w:rPr>
+                <w:b/>
+                <w:color w:val="FFFFFF"/>
+                <w:sz w:val="18"/>
+              </w:rPr>
+              <w:t>Weighting</w:t>
+            </w:r>
+          </w:p>
+        </w:tc>
+        <w:tc>
+          <w:tcPr>
+            <w:tcW w:type="dxa" w:w="1440"/>
+            <w:shd w:val="clear" w:color="auto" w:fill="B87333"/>
+          </w:tcPr>
+          <w:p>
+            <w:pPr>
+              <w:jc w:val="center"/>
+            </w:pPr>
+            <w:r>
+              <w:rPr>
+                <w:b/>
+                <w:color w:val="FFFFFF"/>
+                <w:sz w:val="18"/>
+              </w:rPr>
+              <w:t>Gross Sharpe</w:t>
+            </w:r>
+          </w:p>
+        </w:tc>
+        <w:tc>
+          <w:tcPr>
+            <w:tcW w:type="dxa" w:w="1296"/>
+            <w:shd w:val="clear" w:color="auto" w:fill="B87333"/>
+          </w:tcPr>
+          <w:p>
+            <w:pPr>
+              <w:jc w:val="center"/>
+            </w:pPr>
+            <w:r>
+              <w:rPr>
+                <w:b/>
+                <w:color w:val="FFFFFF"/>
+                <w:sz w:val="18"/>
+              </w:rPr>
+              <w:t>Net 5bps</w:t>
+            </w:r>
+          </w:p>
+        </w:tc>
+        <w:tc>
+          <w:tcPr>
+            <w:tcW w:type="dxa" w:w="1296"/>
+            <w:shd w:val="clear" w:color="auto" w:fill="B87333"/>
+          </w:tcPr>
+          <w:p>
+            <w:pPr>
+              <w:jc w:val="center"/>
+            </w:pPr>
+            <w:r>
+              <w:rPr>
+                <w:b/>
+                <w:color w:val="FFFFFF"/>
+                <w:sz w:val="18"/>
+              </w:rPr>
+              <w:t>Net 10bps</w:t>
+            </w:r>
+          </w:p>
+        </w:tc>
+        <w:tc>
+          <w:tcPr>
+            <w:tcW w:type="dxa" w:w="1008"/>
+            <w:shd w:val="clear" w:color="auto" w:fill="B87333"/>
+          </w:tcPr>
+          <w:p>
+            <w:pPr>
+              <w:jc w:val="center"/>
+            </w:pPr>
+            <w:r>
+              <w:rPr>
+                <w:b/>
+                <w:color w:val="FFFFFF"/>
+                <w:sz w:val="18"/>
+              </w:rPr>
+              <w:t>Ann %</w:t>
+            </w:r>
+          </w:p>
+        </w:tc>
+        <w:tc>
+          <w:tcPr>
+            <w:tcW w:type="dxa" w:w="1584"/>
+            <w:shd w:val="clear" w:color="auto" w:fill="B87333"/>
+          </w:tcPr>
+          <w:p>
+            <w:pPr>
+              <w:jc w:val="center"/>
+            </w:pPr>
+            <w:r>
+              <w:rPr>
+                <w:b/>
+                <w:color w:val="FFFFFF"/>
+                <w:sz w:val="18"/>
+              </w:rPr>
+              <w:t>Max DD ($/MT)</w:t>
+            </w:r>
+          </w:p>
+        </w:tc>
+      </w:tr>
+      <w:tr>
+        <w:tc>
+          <w:tcPr>
+            <w:tcW w:type="dxa" w:w="1624"/>
+            <w:shd w:val="clear" w:color="auto" w:fill="F5EFE8"/>
+          </w:tcPr>
+          <w:p>
+            <w:pPr>
+              <w:jc w:val="left"/>
+            </w:pPr>
+            <w:r>
+              <w:rPr>
+                <w:b/>
+                <w:sz w:val="18"/>
+              </w:rPr>
+              <w:t>Equal-Weight (1/3 each)</w:t>
+            </w:r>
+          </w:p>
+        </w:tc>
+        <w:tc>
+          <w:tcPr>
+            <w:tcW w:type="dxa" w:w="1624"/>
+            <w:shd w:val="clear" w:color="auto" w:fill="F5EFE8"/>
+          </w:tcPr>
+          <w:p>
+            <w:pPr>
+              <w:jc w:val="center"/>
+            </w:pPr>
+            <w:r>
+              <w:rPr>
+                <w:sz w:val="18"/>
+              </w:rPr>
+              <w:t>1.045</w:t>
+            </w:r>
+          </w:p>
+        </w:tc>
+        <w:tc>
+          <w:tcPr>
+            <w:tcW w:type="dxa" w:w="1624"/>
+            <w:shd w:val="clear" w:color="auto" w:fill="F5EFE8"/>
+          </w:tcPr>
+          <w:p>
+            <w:pPr>
+              <w:jc w:val="center"/>
+            </w:pPr>
+            <w:r>
+              <w:rPr>
+                <w:sz w:val="18"/>
+              </w:rPr>
+              <w:t>0.959</w:t>
+            </w:r>
+          </w:p>
+        </w:tc>
+        <w:tc>
+          <w:tcPr>
+            <w:tcW w:type="dxa" w:w="1624"/>
+            <w:shd w:val="clear" w:color="auto" w:fill="F5EFE8"/>
+          </w:tcPr>
+          <w:p>
+            <w:pPr>
+              <w:jc w:val="center"/>
+            </w:pPr>
+            <w:r>
+              <w:rPr>
+                <w:sz w:val="18"/>
+              </w:rPr>
+              <w:t>0.899</w:t>
+            </w:r>
+          </w:p>
+        </w:tc>
+        <w:tc>
+          <w:tcPr>
+            <w:tcW w:type="dxa" w:w="1624"/>
+            <w:shd w:val="clear" w:color="auto" w:fill="F5EFE8"/>
+          </w:tcPr>
+          <w:p>
+            <w:pPr>
+              <w:jc w:val="center"/>
+            </w:pPr>
+            <w:r>
+              <w:rPr>
+                <w:sz w:val="18"/>
+              </w:rPr>
+              <w:t>11.9</w:t>
+            </w:r>
+          </w:p>
+        </w:tc>
+        <w:tc>
+          <w:tcPr>
+            <w:tcW w:type="dxa" w:w="1624"/>
+            <w:shd w:val="clear" w:color="auto" w:fill="F5EFE8"/>
+          </w:tcPr>
+          <w:p>
+            <w:pPr>
+              <w:jc w:val="center"/>
+            </w:pPr>
+            <w:r>
+              <w:rPr>
+                <w:sz w:val="18"/>
+              </w:rPr>
+              <w:t>−2,020</w:t>
+            </w:r>
+          </w:p>
+        </w:tc>
+      </w:tr>
+      <w:tr>
+        <w:tc>
+          <w:tcPr>
+            <w:tcW w:type="dxa" w:w="1624"/>
+            <w:shd w:val="clear" w:color="auto" w:fill="FAFAFA"/>
+          </w:tcPr>
+          <w:p>
+            <w:pPr>
+              <w:jc w:val="left"/>
+            </w:pPr>
+            <w:r>
+              <w:rPr>
+                <w:b/>
+                <w:sz w:val="18"/>
+              </w:rPr>
+              <w:t>Inverse-Vol — 10d</w:t>
+            </w:r>
+          </w:p>
+        </w:tc>
+        <w:tc>
+          <w:tcPr>
+            <w:tcW w:type="dxa" w:w="1624"/>
+            <w:shd w:val="clear" w:color="auto" w:fill="FAFAFA"/>
+          </w:tcPr>
+          <w:p>
+            <w:pPr>
+              <w:jc w:val="center"/>
+            </w:pPr>
+            <w:r>
+              <w:rPr>
+                <w:sz w:val="18"/>
+              </w:rPr>
+              <w:t>0.858</w:t>
+            </w:r>
+          </w:p>
+        </w:tc>
+        <w:tc>
+          <w:tcPr>
+            <w:tcW w:type="dxa" w:w="1624"/>
+            <w:shd w:val="clear" w:color="auto" w:fill="FAFAFA"/>
+          </w:tcPr>
+          <w:p>
+            <w:pPr>
+              <w:jc w:val="center"/>
+            </w:pPr>
+            <w:r>
+              <w:rPr>
+                <w:sz w:val="18"/>
+              </w:rPr>
+              <w:t>0.800</w:t>
+            </w:r>
+          </w:p>
+        </w:tc>
+        <w:tc>
+          <w:tcPr>
+            <w:tcW w:type="dxa" w:w="1624"/>
+            <w:shd w:val="clear" w:color="auto" w:fill="FAFAFA"/>
+          </w:tcPr>
+          <w:p>
+            <w:pPr>
+              <w:jc w:val="center"/>
+            </w:pPr>
+            <w:r>
+              <w:rPr>
+                <w:sz w:val="18"/>
+              </w:rPr>
+              <w:t>0.743</w:t>
+            </w:r>
+          </w:p>
+        </w:tc>
+        <w:tc>
+          <w:tcPr>
+            <w:tcW w:type="dxa" w:w="1624"/>
+            <w:shd w:val="clear" w:color="auto" w:fill="FAFAFA"/>
+          </w:tcPr>
+          <w:p>
+            <w:pPr>
+              <w:jc w:val="center"/>
+            </w:pPr>
+            <w:r>
+              <w:rPr>
+                <w:sz w:val="18"/>
+              </w:rPr>
+              <w:t>13.3</w:t>
+            </w:r>
+          </w:p>
+        </w:tc>
+        <w:tc>
+          <w:tcPr>
+            <w:tcW w:type="dxa" w:w="1624"/>
+            <w:shd w:val="clear" w:color="auto" w:fill="FAFAFA"/>
+          </w:tcPr>
+          <w:p>
+            <w:pPr>
+              <w:jc w:val="center"/>
+            </w:pPr>
+            <w:r>
+              <w:rPr>
+                <w:sz w:val="18"/>
+              </w:rPr>
+              <w:t>−3,064</w:t>
+            </w:r>
+          </w:p>
+        </w:tc>
+      </w:tr>
+      <w:tr>
+        <w:tc>
+          <w:tcPr>
+            <w:tcW w:type="dxa" w:w="1624"/>
+            <w:shd w:val="clear" w:color="auto" w:fill="F5EFE8"/>
+          </w:tcPr>
+          <w:p>
+            <w:pPr>
+              <w:jc w:val="left"/>
+            </w:pPr>
+            <w:r>
+              <w:rPr>
+                <w:b/>
+                <w:sz w:val="18"/>
+              </w:rPr>
+              <w:t>Inverse-Vol — 21d</w:t>
+            </w:r>
+          </w:p>
+        </w:tc>
+        <w:tc>
+          <w:tcPr>
+            <w:tcW w:type="dxa" w:w="1624"/>
+            <w:shd w:val="clear" w:color="auto" w:fill="F5EFE8"/>
+          </w:tcPr>
+          <w:p>
+            <w:pPr>
+              <w:jc w:val="center"/>
+            </w:pPr>
+            <w:r>
+              <w:rPr>
+                <w:sz w:val="18"/>
+              </w:rPr>
+              <w:t>0.908</w:t>
+            </w:r>
+          </w:p>
+        </w:tc>
+        <w:tc>
+          <w:tcPr>
+            <w:tcW w:type="dxa" w:w="1624"/>
+            <w:shd w:val="clear" w:color="auto" w:fill="F5EFE8"/>
+          </w:tcPr>
+          <w:p>
+            <w:pPr>
+              <w:jc w:val="center"/>
+            </w:pPr>
+            <w:r>
+              <w:rPr>
+                <w:sz w:val="18"/>
+              </w:rPr>
+              <w:t>0.852</w:t>
+            </w:r>
+          </w:p>
+        </w:tc>
+        <w:tc>
+          <w:tcPr>
+            <w:tcW w:type="dxa" w:w="1624"/>
+            <w:shd w:val="clear" w:color="auto" w:fill="F5EFE8"/>
+          </w:tcPr>
+          <w:p>
+            <w:pPr>
+              <w:jc w:val="center"/>
+            </w:pPr>
+            <w:r>
+              <w:rPr>
+                <w:sz w:val="18"/>
+              </w:rPr>
+              <w:t>0.797</w:t>
+            </w:r>
+          </w:p>
+        </w:tc>
+        <w:tc>
+          <w:tcPr>
+            <w:tcW w:type="dxa" w:w="1624"/>
+            <w:shd w:val="clear" w:color="auto" w:fill="F5EFE8"/>
+          </w:tcPr>
+          <w:p>
+            <w:pPr>
+              <w:jc w:val="center"/>
+            </w:pPr>
+            <w:r>
+              <w:rPr>
+                <w:sz w:val="18"/>
+              </w:rPr>
+              <w:t>13.7</w:t>
+            </w:r>
+          </w:p>
+        </w:tc>
+        <w:tc>
+          <w:tcPr>
+            <w:tcW w:type="dxa" w:w="1624"/>
+            <w:shd w:val="clear" w:color="auto" w:fill="F5EFE8"/>
+          </w:tcPr>
+          <w:p>
+            <w:pPr>
+              <w:jc w:val="center"/>
+            </w:pPr>
+            <w:r>
+              <w:rPr>
+                <w:sz w:val="18"/>
+              </w:rPr>
+              <w:t>−3,040</w:t>
+            </w:r>
+          </w:p>
+        </w:tc>
+      </w:tr>
+      <w:tr>
+        <w:tc>
+          <w:tcPr>
+            <w:tcW w:type="dxa" w:w="1624"/>
+            <w:shd w:val="clear" w:color="auto" w:fill="FAFAFA"/>
+          </w:tcPr>
+          <w:p>
+            <w:pPr>
+              <w:jc w:val="left"/>
+            </w:pPr>
+            <w:r>
+              <w:rPr>
+                <w:b/>
+                <w:sz w:val="18"/>
+              </w:rPr>
+              <w:t>Inverse-Vol — 42d</w:t>
+            </w:r>
+          </w:p>
+        </w:tc>
+        <w:tc>
+          <w:tcPr>
+            <w:tcW w:type="dxa" w:w="1624"/>
+            <w:shd w:val="clear" w:color="auto" w:fill="FAFAFA"/>
+          </w:tcPr>
+          <w:p>
+            <w:pPr>
+              <w:jc w:val="center"/>
+            </w:pPr>
+            <w:r>
+              <w:rPr>
+                <w:sz w:val="18"/>
+              </w:rPr>
+              <w:t>0.903</w:t>
+            </w:r>
+          </w:p>
+        </w:tc>
+        <w:tc>
+          <w:tcPr>
+            <w:tcW w:type="dxa" w:w="1624"/>
+            <w:shd w:val="clear" w:color="auto" w:fill="FAFAFA"/>
+          </w:tcPr>
+          <w:p>
+            <w:pPr>
+              <w:jc w:val="center"/>
+            </w:pPr>
+            <w:r>
+              <w:rPr>
+                <w:sz w:val="18"/>
+              </w:rPr>
+              <w:t>0.848</w:t>
+            </w:r>
+          </w:p>
+        </w:tc>
+        <w:tc>
+          <w:tcPr>
+            <w:tcW w:type="dxa" w:w="1624"/>
+            <w:shd w:val="clear" w:color="auto" w:fill="FAFAFA"/>
+          </w:tcPr>
+          <w:p>
+            <w:pPr>
+              <w:jc w:val="center"/>
+            </w:pPr>
+            <w:r>
+              <w:rPr>
+                <w:sz w:val="18"/>
+              </w:rPr>
+              <w:t>0.794</w:t>
+            </w:r>
+          </w:p>
+        </w:tc>
+        <w:tc>
+          <w:tcPr>
+            <w:tcW w:type="dxa" w:w="1624"/>
+            <w:shd w:val="clear" w:color="auto" w:fill="FAFAFA"/>
+          </w:tcPr>
+          <w:p>
+            <w:pPr>
+              <w:jc w:val="center"/>
+            </w:pPr>
+            <w:r>
+              <w:rPr>
+                <w:sz w:val="18"/>
+              </w:rPr>
+              <w:t>13.3</w:t>
+            </w:r>
+          </w:p>
+        </w:tc>
+        <w:tc>
+          <w:tcPr>
+            <w:tcW w:type="dxa" w:w="1624"/>
+            <w:shd w:val="clear" w:color="auto" w:fill="FAFAFA"/>
+          </w:tcPr>
+          <w:p>
+            <w:pPr>
+              <w:jc w:val="center"/>
+            </w:pPr>
+            <w:r>
+              <w:rPr>
+                <w:sz w:val="18"/>
+              </w:rPr>
+              <w:t>−3,054</w:t>
+            </w:r>
+          </w:p>
+        </w:tc>
+      </w:tr>
+      <w:tr>
+        <w:tc>
+          <w:tcPr>
+            <w:tcW w:type="dxa" w:w="1624"/>
+            <w:shd w:val="clear" w:color="auto" w:fill="F5EFE8"/>
+          </w:tcPr>
+          <w:p>
+            <w:pPr>
+              <w:jc w:val="left"/>
+            </w:pPr>
+            <w:r>
+              <w:rPr>
+                <w:b/>
+                <w:sz w:val="18"/>
+              </w:rPr>
+              <w:t>Inverse-Vol — 63d (selected)</w:t>
+            </w:r>
+          </w:p>
+        </w:tc>
+        <w:tc>
+          <w:tcPr>
+            <w:tcW w:type="dxa" w:w="1624"/>
+            <w:shd w:val="clear" w:color="auto" w:fill="F5EFE8"/>
+          </w:tcPr>
+          <w:p>
+            <w:pPr>
+              <w:jc w:val="center"/>
+            </w:pPr>
+            <w:r>
+              <w:rPr>
+                <w:sz w:val="18"/>
+              </w:rPr>
+              <w:t>0.941</w:t>
+            </w:r>
+          </w:p>
+        </w:tc>
+        <w:tc>
+          <w:tcPr>
+            <w:tcW w:type="dxa" w:w="1624"/>
+            <w:shd w:val="clear" w:color="auto" w:fill="F5EFE8"/>
+          </w:tcPr>
+          <w:p>
+            <w:pPr>
+              <w:jc w:val="center"/>
+            </w:pPr>
+            <w:r>
+              <w:rPr>
+                <w:sz w:val="18"/>
+              </w:rPr>
+              <w:t>0.887</w:t>
+            </w:r>
+          </w:p>
+        </w:tc>
+        <w:tc>
+          <w:tcPr>
+            <w:tcW w:type="dxa" w:w="1624"/>
+            <w:shd w:val="clear" w:color="auto" w:fill="F5EFE8"/>
+          </w:tcPr>
+          <w:p>
+            <w:pPr>
+              <w:jc w:val="center"/>
+            </w:pPr>
+            <w:r>
+              <w:rPr>
+                <w:sz w:val="18"/>
+              </w:rPr>
+              <w:t>0.833</w:t>
+            </w:r>
+          </w:p>
+        </w:tc>
+        <w:tc>
+          <w:tcPr>
+            <w:tcW w:type="dxa" w:w="1624"/>
+            <w:shd w:val="clear" w:color="auto" w:fill="F5EFE8"/>
+          </w:tcPr>
+          <w:p>
+            <w:pPr>
+              <w:jc w:val="center"/>
+            </w:pPr>
+            <w:r>
+              <w:rPr>
+                <w:sz w:val="18"/>
+              </w:rPr>
+              <w:t>13.5</w:t>
+            </w:r>
+          </w:p>
+        </w:tc>
+        <w:tc>
+          <w:tcPr>
+            <w:tcW w:type="dxa" w:w="1624"/>
+            <w:shd w:val="clear" w:color="auto" w:fill="F5EFE8"/>
+          </w:tcPr>
+          <w:p>
+            <w:pPr>
+              <w:jc w:val="center"/>
+            </w:pPr>
+            <w:r>
+              <w:rPr>
+                <w:sz w:val="18"/>
+              </w:rPr>
+              <w:t>−3,031</w:t>
+            </w:r>
+          </w:p>
+        </w:tc>
+      </w:tr>
+      <w:tr>
+        <w:tc>
+          <w:tcPr>
+            <w:tcW w:type="dxa" w:w="1624"/>
+            <w:shd w:val="clear" w:color="auto" w:fill="FAFAFA"/>
+          </w:tcPr>
+          <w:p>
+            <w:pPr>
+              <w:jc w:val="left"/>
+            </w:pPr>
+            <w:r>
+              <w:rPr>
+                <w:b/>
+                <w:sz w:val="18"/>
+              </w:rPr>
+              <w:t>Inverse-Vol — 126d</w:t>
+            </w:r>
+          </w:p>
+        </w:tc>
+        <w:tc>
+          <w:tcPr>
+            <w:tcW w:type="dxa" w:w="1624"/>
+            <w:shd w:val="clear" w:color="auto" w:fill="FAFAFA"/>
+          </w:tcPr>
+          <w:p>
+            <w:pPr>
+              <w:jc w:val="center"/>
+            </w:pPr>
+            <w:r>
+              <w:rPr>
+                <w:sz w:val="18"/>
+              </w:rPr>
+              <w:t>0.906</w:t>
+            </w:r>
+          </w:p>
+        </w:tc>
+        <w:tc>
+          <w:tcPr>
+            <w:tcW w:type="dxa" w:w="1624"/>
+            <w:shd w:val="clear" w:color="auto" w:fill="FAFAFA"/>
+          </w:tcPr>
+          <w:p>
+            <w:pPr>
+              <w:jc w:val="center"/>
+            </w:pPr>
+            <w:r>
+              <w:rPr>
+                <w:sz w:val="18"/>
+              </w:rPr>
+              <w:t>0.852</w:t>
+            </w:r>
+          </w:p>
+        </w:tc>
+        <w:tc>
+          <w:tcPr>
+            <w:tcW w:type="dxa" w:w="1624"/>
+            <w:shd w:val="clear" w:color="auto" w:fill="FAFAFA"/>
+          </w:tcPr>
+          <w:p>
+            <w:pPr>
+              <w:jc w:val="center"/>
+            </w:pPr>
+            <w:r>
+              <w:rPr>
+                <w:sz w:val="18"/>
+              </w:rPr>
+              <w:t>0.800</w:t>
+            </w:r>
+          </w:p>
+        </w:tc>
+        <w:tc>
+          <w:tcPr>
+            <w:tcW w:type="dxa" w:w="1624"/>
+            <w:shd w:val="clear" w:color="auto" w:fill="FAFAFA"/>
+          </w:tcPr>
+          <w:p>
+            <w:pPr>
+              <w:jc w:val="center"/>
+            </w:pPr>
+            <w:r>
+              <w:rPr>
+                <w:sz w:val="18"/>
+              </w:rPr>
+              <w:t>12.4</w:t>
+            </w:r>
+          </w:p>
+        </w:tc>
+        <w:tc>
+          <w:tcPr>
+            <w:tcW w:type="dxa" w:w="1624"/>
+            <w:shd w:val="clear" w:color="auto" w:fill="FAFAFA"/>
+          </w:tcPr>
+          <w:p>
+            <w:pPr>
+              <w:jc w:val="center"/>
+            </w:pPr>
+            <w:r>
+              <w:rPr>
+                <w:sz w:val="18"/>
+              </w:rPr>
+              <w:t>−3,038</w:t>
+            </w:r>
+          </w:p>
+        </w:tc>
+      </w:tr>
+      <w:tr>
+        <w:tc>
+          <w:tcPr>
+            <w:tcW w:type="dxa" w:w="1624"/>
+            <w:shd w:val="clear" w:color="auto" w:fill="F5EFE8"/>
+          </w:tcPr>
+          <w:p>
+            <w:pPr>
+              <w:jc w:val="left"/>
+            </w:pPr>
+            <w:r>
+              <w:rPr>
+                <w:b/>
+                <w:sz w:val="18"/>
+              </w:rPr>
+              <w:t>Inverse-Vol — 189d</w:t>
+            </w:r>
+          </w:p>
+        </w:tc>
+        <w:tc>
+          <w:tcPr>
+            <w:tcW w:type="dxa" w:w="1624"/>
+            <w:shd w:val="clear" w:color="auto" w:fill="F5EFE8"/>
+          </w:tcPr>
+          <w:p>
+            <w:pPr>
+              <w:jc w:val="center"/>
+            </w:pPr>
+            <w:r>
+              <w:rPr>
+                <w:sz w:val="18"/>
+              </w:rPr>
+              <w:t>0.910</w:t>
+            </w:r>
+          </w:p>
+        </w:tc>
+        <w:tc>
+          <w:tcPr>
+            <w:tcW w:type="dxa" w:w="1624"/>
+            <w:shd w:val="clear" w:color="auto" w:fill="F5EFE8"/>
+          </w:tcPr>
+          <w:p>
+            <w:pPr>
+              <w:jc w:val="center"/>
+            </w:pPr>
+            <w:r>
+              <w:rPr>
+                <w:sz w:val="18"/>
+              </w:rPr>
+              <w:t>0.858</w:t>
+            </w:r>
+          </w:p>
+        </w:tc>
+        <w:tc>
+          <w:tcPr>
+            <w:tcW w:type="dxa" w:w="1624"/>
+            <w:shd w:val="clear" w:color="auto" w:fill="F5EFE8"/>
+          </w:tcPr>
+          <w:p>
+            <w:pPr>
+              <w:jc w:val="center"/>
+            </w:pPr>
+            <w:r>
+              <w:rPr>
+                <w:sz w:val="18"/>
+              </w:rPr>
+              <w:t>0.807</w:t>
+            </w:r>
+          </w:p>
+        </w:tc>
+        <w:tc>
+          <w:tcPr>
+            <w:tcW w:type="dxa" w:w="1624"/>
+            <w:shd w:val="clear" w:color="auto" w:fill="F5EFE8"/>
+          </w:tcPr>
+          <w:p>
+            <w:pPr>
+              <w:jc w:val="center"/>
+            </w:pPr>
+            <w:r>
+              <w:rPr>
+                <w:sz w:val="18"/>
+              </w:rPr>
+              <w:t>12.2</w:t>
+            </w:r>
+          </w:p>
+        </w:tc>
+        <w:tc>
+          <w:tcPr>
+            <w:tcW w:type="dxa" w:w="1624"/>
+            <w:shd w:val="clear" w:color="auto" w:fill="F5EFE8"/>
+          </w:tcPr>
+          <w:p>
+            <w:pPr>
+              <w:jc w:val="center"/>
+            </w:pPr>
+            <w:r>
+              <w:rPr>
+                <w:sz w:val="18"/>
+              </w:rPr>
+              <w:t>−3,031</w:t>
+            </w:r>
+          </w:p>
+        </w:tc>
+      </w:tr>
+      <w:tr>
+        <w:tc>
+          <w:tcPr>
+            <w:tcW w:type="dxa" w:w="1624"/>
+            <w:shd w:val="clear" w:color="auto" w:fill="FAFAFA"/>
+          </w:tcPr>
+          <w:p>
+            <w:pPr>
+              <w:jc w:val="left"/>
+            </w:pPr>
+            <w:r>
+              <w:rPr>
+                <w:b/>
+                <w:sz w:val="18"/>
+              </w:rPr>
+              <w:t>Inverse-Vol — 252d</w:t>
+            </w:r>
+          </w:p>
+        </w:tc>
+        <w:tc>
+          <w:tcPr>
+            <w:tcW w:type="dxa" w:w="1624"/>
+            <w:shd w:val="clear" w:color="auto" w:fill="FAFAFA"/>
+          </w:tcPr>
+          <w:p>
+            <w:pPr>
+              <w:jc w:val="center"/>
+            </w:pPr>
+            <w:r>
+              <w:rPr>
+                <w:sz w:val="18"/>
+              </w:rPr>
+              <w:t>0.884</w:t>
+            </w:r>
+          </w:p>
+        </w:tc>
+        <w:tc>
+          <w:tcPr>
+            <w:tcW w:type="dxa" w:w="1624"/>
+            <w:shd w:val="clear" w:color="auto" w:fill="FAFAFA"/>
+          </w:tcPr>
+          <w:p>
+            <w:pPr>
+              <w:jc w:val="center"/>
+            </w:pPr>
+            <w:r>
+              <w:rPr>
+                <w:sz w:val="18"/>
+              </w:rPr>
+              <w:t>0.832</w:t>
+            </w:r>
+          </w:p>
+        </w:tc>
+        <w:tc>
+          <w:tcPr>
+            <w:tcW w:type="dxa" w:w="1624"/>
+            <w:shd w:val="clear" w:color="auto" w:fill="FAFAFA"/>
+          </w:tcPr>
+          <w:p>
+            <w:pPr>
+              <w:jc w:val="center"/>
+            </w:pPr>
+            <w:r>
+              <w:rPr>
+                <w:sz w:val="18"/>
+              </w:rPr>
+              <w:t>0.782</w:t>
+            </w:r>
+          </w:p>
+        </w:tc>
+        <w:tc>
+          <w:tcPr>
+            <w:tcW w:type="dxa" w:w="1624"/>
+            <w:shd w:val="clear" w:color="auto" w:fill="FAFAFA"/>
+          </w:tcPr>
+          <w:p>
+            <w:pPr>
+              <w:jc w:val="center"/>
+            </w:pPr>
+            <w:r>
+              <w:rPr>
+                <w:sz w:val="18"/>
+              </w:rPr>
+              <w:t>11.7</w:t>
+            </w:r>
+          </w:p>
+        </w:tc>
+        <w:tc>
+          <w:tcPr>
+            <w:tcW w:type="dxa" w:w="1624"/>
+            <w:shd w:val="clear" w:color="auto" w:fill="FAFAFA"/>
+          </w:tcPr>
+          <w:p>
+            <w:pPr>
+              <w:jc w:val="center"/>
+            </w:pPr>
+            <w:r>
+              <w:rPr>
+                <w:sz w:val="18"/>
+              </w:rPr>
+              <w:t>−3,029</w:t>
+            </w:r>
+          </w:p>
+        </w:tc>
+      </w:tr>
+    </w:tbl>
+    <w:p>
+      <w:pPr>
+        <w:spacing w:before="0" w:after="80"/>
+      </w:pPr>
+    </w:p>
+    <w:p>
+      <w:pPr>
+        <w:spacing w:before="0" w:after="80"/>
+      </w:pPr>
+      <w:r>
+        <w:rPr>
+          <w:i/>
+          <w:sz w:val="19"/>
+        </w:rPr>
+        <w:t>Findings: (i) the 63-day trailing window is the Sharpe-optimal inverse-vol horizon, gross and net of costs — shorter windows (≤21d) are too noisy and raise turnover, while longer windows (≥126d) give up return without improving Sharpe. (ii) Equal-weight still dominates every inverse-vol window on net Sharpe and has a materially shallower drawdown (−$2,020 vs ≈ −$3,030/MT), so EW remains the portfolio default; inverse-vol trades a higher annual return (~13.5%) for worse risk-adjusted performance. (iii) Transaction costs penalise inverse-vol more, owing to its daily reweighting turnover.</w:t>
+      </w:r>
+    </w:p>
+    <w:p>
+      <w:pPr>
         <w:spacing w:before="0" w:after="80"/>
       </w:pPr>
     </w:p>

</xml_diff>